<commit_message>
latest results based on simulated data uploaded
</commit_message>
<xml_diff>
--- a/i_test/test_D6_Table_S1/g_output/D6_Table_S1_attrition_DPP4i.docx
+++ b/i_test/test_D6_Table_S1/g_output/D6_Table_S1_attrition_DPP4i.docx
@@ -17,7 +17,7 @@
               <w:pStyle w:val="Normal"/>
             </w:pPr>
             <w:r>
-              <w:t>Totale popolazione in studio</w:t>
+              <w:t>Soggetti con almeno un farmaco nella storia e un observation period che overlappa lo study period</w:t>
             </w:r>
           </w:p>
         </w:tc>
@@ -39,17 +39,17 @@
               <w:pStyle w:val="Normal"/>
             </w:pPr>
             <w:r>
-              <w:t>Totale soggetti registrati in anagrafe sanitaria al 1 gennaio di ogni anno tra 2016 e 2025</w:t>
-            </w:r>
-          </w:p>
-        </w:tc>
-        <w:tc>
-          <w:p>
-            <w:pPr>
-              <w:pStyle w:val="Normal"/>
-            </w:pPr>
-            <w:r>
-              <w:t>1.428 (28,6%)</w:t>
+              <w:t>Totale soggetti registrati in anagrafe sanitaria per almeno un giorno tra il 01/01/2016 e il 31/12/2025</w:t>
+            </w:r>
+          </w:p>
+        </w:tc>
+        <w:tc>
+          <w:p>
+            <w:pPr>
+              <w:pStyle w:val="Normal"/>
+            </w:pPr>
+            <w:r>
+              <w:t>4.002 (80,0%)</w:t>
             </w:r>
           </w:p>
         </w:tc>
@@ -61,17 +61,17 @@
               <w:pStyle w:val="Normal"/>
             </w:pPr>
             <w:r>
-              <w:t>Soggetti con una finestra di osservazione</w:t>
-            </w:r>
-          </w:p>
-        </w:tc>
-        <w:tc>
-          <w:p>
-            <w:pPr>
-              <w:pStyle w:val="Normal"/>
-            </w:pPr>
-            <w:r>
-              <w:t>4.315 (86,3%)</w:t>
+              <w:t>Soggetti con un periodo di osservazione</w:t>
+            </w:r>
+          </w:p>
+        </w:tc>
+        <w:tc>
+          <w:p>
+            <w:pPr>
+              <w:pStyle w:val="Normal"/>
+            </w:pPr>
+            <w:r>
+              <w:t>4.000 (80,0%)</w:t>
             </w:r>
           </w:p>
         </w:tc>
@@ -83,17 +83,17 @@
               <w:pStyle w:val="Normal"/>
             </w:pPr>
             <w:r>
-              <w:t>Soggetti con almeno 2 anni di osservazione precedenti alla data di ingresso nella coorte di studio</w:t>
-            </w:r>
-          </w:p>
-        </w:tc>
-        <w:tc>
-          <w:p>
-            <w:pPr>
-              <w:pStyle w:val="Normal"/>
-            </w:pPr>
-            <w:r>
-              <w:t>4.474 (89,5%)</w:t>
+              <w:t>Soggetti con un periodo di osservazione coincidente con il periodo di studio</w:t>
+            </w:r>
+          </w:p>
+        </w:tc>
+        <w:tc>
+          <w:p>
+            <w:pPr>
+              <w:pStyle w:val="Normal"/>
+            </w:pPr>
+            <w:r>
+              <w:t>4.034 (80,7%)</w:t>
             </w:r>
           </w:p>
         </w:tc>
@@ -105,17 +105,17 @@
               <w:pStyle w:val="Normal"/>
             </w:pPr>
             <w:r>
-              <w:t>Soggetti con prima dispensazione di farmaci di interesse nel periodo gen2016 - dic2025</w:t>
-            </w:r>
-          </w:p>
-        </w:tc>
-        <w:tc>
-          <w:p>
-            <w:pPr>
-              <w:pStyle w:val="Normal"/>
-            </w:pPr>
-            <w:r>
-              <w:t>3.975 (79,5%)</w:t>
+              <w:t>Soggetti 18+ in almeno un giorno durante il periodo di studio</w:t>
+            </w:r>
+          </w:p>
+        </w:tc>
+        <w:tc>
+          <w:p>
+            <w:pPr>
+              <w:pStyle w:val="Normal"/>
+            </w:pPr>
+            <w:r>
+              <w:t>4.010 (80,2%)</w:t>
             </w:r>
           </w:p>
         </w:tc>
@@ -127,17 +127,127 @@
               <w:pStyle w:val="Normal"/>
             </w:pPr>
             <w:r>
-              <w:t>Soggetti incidenti</w:t>
-            </w:r>
-          </w:p>
-        </w:tc>
-        <w:tc>
-          <w:p>
-            <w:pPr>
-              <w:pStyle w:val="Normal"/>
-            </w:pPr>
-            <w:r>
-              <w:t>2.952 (59,0%)</w:t>
+              <w:t>Soggetti con almeno una dispensazione del farmaco di interesse nell’istanza</w:t>
+            </w:r>
+          </w:p>
+        </w:tc>
+        <w:tc>
+          <w:p>
+            <w:pPr>
+              <w:pStyle w:val="Normal"/>
+            </w:pPr>
+            <w:r>
+              <w:t>3.976 (79,5%)</w:t>
+            </w:r>
+          </w:p>
+        </w:tc>
+      </w:tr>
+      <w:tr>
+        <w:tc>
+          <w:p>
+            <w:pPr>
+              <w:pStyle w:val="Normal"/>
+            </w:pPr>
+            <w:r>
+              <w:t>Soggetti con almeno una dispensazione del farmaco di interesse nel periodo di studio</w:t>
+            </w:r>
+          </w:p>
+        </w:tc>
+        <w:tc>
+          <w:p>
+            <w:pPr>
+              <w:pStyle w:val="Normal"/>
+            </w:pPr>
+            <w:r>
+              <w:t>4.041 (80,8%)</w:t>
+            </w:r>
+          </w:p>
+        </w:tc>
+      </w:tr>
+      <w:tr>
+        <w:tc>
+          <w:p>
+            <w:pPr>
+              <w:pStyle w:val="Normal"/>
+            </w:pPr>
+            <w:r>
+              <w:t>Soggetti con almeno 2 anni di osservazione precedenti alla prima data di dispensazione del farmaco di interesse durante il periodo di studio (data indice)</w:t>
+            </w:r>
+          </w:p>
+        </w:tc>
+        <w:tc>
+          <w:p>
+            <w:pPr>
+              <w:pStyle w:val="Normal"/>
+            </w:pPr>
+            <w:r>
+              <w:t>4.015 (80,3%)</w:t>
+            </w:r>
+          </w:p>
+        </w:tc>
+      </w:tr>
+      <w:tr>
+        <w:tc>
+          <w:p>
+            <w:pPr>
+              <w:pStyle w:val="Normal"/>
+            </w:pPr>
+            <w:r>
+              <w:t>Soggetti con ASL registrata alla data indice</w:t>
+            </w:r>
+          </w:p>
+        </w:tc>
+        <w:tc>
+          <w:p>
+            <w:pPr>
+              <w:pStyle w:val="Normal"/>
+            </w:pPr>
+            <w:r>
+              <w:t>4.042 (80,8%)</w:t>
+            </w:r>
+          </w:p>
+        </w:tc>
+      </w:tr>
+      <w:tr>
+        <w:tc>
+          <w:p>
+            <w:pPr>
+              <w:pStyle w:val="Normal"/>
+            </w:pPr>
+            <w:r>
+              <w:t>Soggetti con nessuna dispensazione del farmaco di interesse nei due anni precedenti la data indice</w:t>
+            </w:r>
+          </w:p>
+        </w:tc>
+        <w:tc>
+          <w:p>
+            <w:pPr>
+              <w:pStyle w:val="Normal"/>
+            </w:pPr>
+            <w:r>
+              <w:t>437 (8,7%)</w:t>
+            </w:r>
+          </w:p>
+        </w:tc>
+      </w:tr>
+      <w:tr>
+        <w:tc>
+          <w:p>
+            <w:pPr>
+              <w:pStyle w:val="Normal"/>
+            </w:pPr>
+            <w:r>
+              <w:t>Totale soggetti inclusi nella coorte di studio</w:t>
+            </w:r>
+          </w:p>
+        </w:tc>
+        <w:tc>
+          <w:p>
+            <w:pPr>
+              <w:pStyle w:val="Normal"/>
+            </w:pPr>
+            <w:r>
+              <w:t>842 (16,8%)</w:t>
             </w:r>
           </w:p>
         </w:tc>

</xml_diff>